<commit_message>
Multimeter works and Copilot says it's looks OK BdmProtocol and Aneng Updated tags and tag comments Better multimeter colors via Copilot AI
</commit_message>
<xml_diff>
--- a/Adding-BT-devices-V5-Xiaomi-Temperature.docx
+++ b/Adding-BT-devices-V5-Xiaomi-Temperature.docx
@@ -49,6 +49,9 @@
       <w:proofErr w:type="gramEnd"/>
       <w:r>
         <w:t xml:space="preserve"> Clock device. The class name (and file names) will be </w:t>
+      </w:r>
+      <w:r>
+        <w:t>BT</w:t>
       </w:r>
       <w:r>
         <w:t>Xiaomi_MJWSD05MMC_Thermometer</w:t>
@@ -624,6 +627,27 @@
       <w:r>
         <w:t>Build and run! The new device should show up (badly)</w:t>
       </w:r>
+    </w:p>
+    <w:p/>
+    <w:p>
+      <w:pPr>
+        <w:pStyle w:val="Heading3"/>
+      </w:pPr>
+      <w:r>
+        <w:t>Update CS that’s marked ‘Modify:’</w:t>
+      </w:r>
+    </w:p>
+    <w:p/>
+    <w:p>
+      <w:pPr>
+        <w:pStyle w:val="Heading3"/>
+      </w:pPr>
+      <w:r>
+        <w:t>Add a new Extension class to make setting the time, units, 12h vs. 24hr easy</w:t>
+      </w:r>
+    </w:p>
+    <w:p/>
+    <w:p>
       <w:r>
         <w:br/>
       </w:r>

</xml_diff>